<commit_message>
Storable: replace numeric dashes with 'to'
Co-Authored-By: Claude Opus 5.5 <noreply@anthropic.com>
Claude-Session: https://claude.ai/code/session_01PnB2ZnAeZHpQqq3EqeSWtT
</commit_message>
<xml_diff>
--- a/applications/storable-senior-client-success-manager/Rotenberg Resume - Storable - Senior Client Success Manager.docx
+++ b/applications/storable-senior-client-success-manager/Rotenberg Resume - Storable - Senior Client Success Manager.docx
@@ -80,7 +80,7 @@
           <w:i w:val="0"/>
           <w:color w:val="1A1A1A"/>
         </w:rPr>
-        <w:t>Client success professional with 15+ years in B2B SaaS connecting operators' business goals to what the software can do. Retained all but one of 15-20 partners at Birdeye, led a team of 20 (later 8) onboarding specialists at Wix, and built implementation plans and advised C-suite leaders at Accelo. Translates business problems into technical configurations and routes client feedback to Product.</w:t>
+        <w:t>Client success professional with 15+ years in B2B SaaS connecting operators' business goals to what the software can do. Retained all but one of 15 to 20 partners at Birdeye, led a team of 20 (later 8) onboarding specialists at Wix, and built implementation plans and advised C-suite leaders at Accelo. Translates business problems into technical configurations and routes client feedback to Product.</w:t>
       </w:r>
     </w:p>
     <w:p>
@@ -357,7 +357,7 @@
           <w:i w:val="0"/>
           <w:color w:val="1A1A1A"/>
         </w:rPr>
-        <w:t>Managed 15-20 reseller partners (deal sizes ~$10K-$45K) serving local businesses across health, home services, and retail, retaining all but one (~94%).</w:t>
+        <w:t>Managed 15 to 20 reseller partners (deal sizes ~$10K-$45K) serving local businesses across health, home services, and retail, retaining all but one (~94%).</w:t>
       </w:r>
     </w:p>
     <w:p>

</xml_diff>